<commit_message>
feat(xlsx): merged cells are read as spans
A merged range's top-left cell carries its colSpan and rowSpan, as the
ODS, DOCX and HTML readers already give them.
</commit_message>
<xml_diff>
--- a/test/generator/baseline/gen.xlsx.to.docx.docx
+++ b/test/generator/baseline/gen.xlsx.to.docx.docx
@@ -4428,19 +4428,20 @@
         </w:tblBorders>
       </w:tblPr>
       <w:tblGrid>
-        <w:gridCol w:w="694"/>
-        <w:gridCol w:w="694"/>
-        <w:gridCol w:w="694"/>
-        <w:gridCol w:w="694"/>
-        <w:gridCol w:w="694"/>
-        <w:gridCol w:w="694"/>
-        <w:gridCol w:w="694"/>
-        <w:gridCol w:w="694"/>
-        <w:gridCol w:w="694"/>
-        <w:gridCol w:w="694"/>
-        <w:gridCol w:w="694"/>
-        <w:gridCol w:w="694"/>
-        <w:gridCol w:w="694"/>
+        <w:gridCol w:w="644"/>
+        <w:gridCol w:w="644"/>
+        <w:gridCol w:w="644"/>
+        <w:gridCol w:w="644"/>
+        <w:gridCol w:w="644"/>
+        <w:gridCol w:w="644"/>
+        <w:gridCol w:w="644"/>
+        <w:gridCol w:w="644"/>
+        <w:gridCol w:w="644"/>
+        <w:gridCol w:w="644"/>
+        <w:gridCol w:w="644"/>
+        <w:gridCol w:w="644"/>
+        <w:gridCol w:w="644"/>
+        <w:gridCol w:w="644"/>
       </w:tblGrid>
       <w:tr>
         <w:tc>
@@ -4538,11 +4539,18 @@
           </w:tcPr>
           <w:p/>
         </w:tc>
-      </w:tr>
-      <w:tr>
-        <w:tc>
-          <w:tcPr>
-            <w:tcW w:w="0" w:type="auto"/>
+        <w:tc>
+          <w:tcPr>
+            <w:tcW w:w="0" w:type="auto"/>
+          </w:tcPr>
+          <w:p/>
+        </w:tc>
+      </w:tr>
+      <w:tr>
+        <w:tc>
+          <w:tcPr>
+            <w:tcW w:w="0" w:type="auto"/>
+            <w:gridSpan w:val="13"/>
           </w:tcPr>
           <w:p>
             <w:r>
@@ -4740,6 +4748,7 @@
         <w:tc>
           <w:tcPr>
             <w:tcW w:w="0" w:type="auto"/>
+            <w:gridSpan w:val="2"/>
           </w:tcPr>
           <w:p>
             <w:r>
@@ -4937,6 +4946,7 @@
         <w:tc>
           <w:tcPr>
             <w:tcW w:w="0" w:type="auto"/>
+            <w:gridSpan w:val="2"/>
           </w:tcPr>
           <w:p>
             <w:r>
@@ -5134,6 +5144,7 @@
         <w:tc>
           <w:tcPr>
             <w:tcW w:w="0" w:type="auto"/>
+            <w:gridSpan w:val="2"/>
           </w:tcPr>
           <w:p>
             <w:r>
@@ -5331,6 +5342,7 @@
         <w:tc>
           <w:tcPr>
             <w:tcW w:w="0" w:type="auto"/>
+            <w:gridSpan w:val="2"/>
           </w:tcPr>
           <w:p>
             <w:r>
@@ -5528,6 +5540,7 @@
         <w:tc>
           <w:tcPr>
             <w:tcW w:w="0" w:type="auto"/>
+            <w:gridSpan w:val="2"/>
           </w:tcPr>
           <w:p>
             <w:r>
@@ -5725,6 +5738,7 @@
         <w:tc>
           <w:tcPr>
             <w:tcW w:w="0" w:type="auto"/>
+            <w:gridSpan w:val="2"/>
           </w:tcPr>
           <w:p>
             <w:r>
@@ -5922,6 +5936,7 @@
         <w:tc>
           <w:tcPr>
             <w:tcW w:w="0" w:type="auto"/>
+            <w:gridSpan w:val="2"/>
           </w:tcPr>
           <w:p>
             <w:r>
@@ -6119,6 +6134,7 @@
         <w:tc>
           <w:tcPr>
             <w:tcW w:w="0" w:type="auto"/>
+            <w:gridSpan w:val="2"/>
           </w:tcPr>
           <w:p>
             <w:r>
@@ -6316,6 +6332,7 @@
         <w:tc>
           <w:tcPr>
             <w:tcW w:w="0" w:type="auto"/>
+            <w:gridSpan w:val="2"/>
           </w:tcPr>
           <w:p>
             <w:r>
@@ -6513,6 +6530,7 @@
         <w:tc>
           <w:tcPr>
             <w:tcW w:w="0" w:type="auto"/>
+            <w:gridSpan w:val="2"/>
           </w:tcPr>
           <w:p>
             <w:r>
@@ -6710,6 +6728,7 @@
         <w:tc>
           <w:tcPr>
             <w:tcW w:w="0" w:type="auto"/>
+            <w:gridSpan w:val="2"/>
           </w:tcPr>
           <w:p>
             <w:r>
@@ -6907,6 +6926,7 @@
         <w:tc>
           <w:tcPr>
             <w:tcW w:w="0" w:type="auto"/>
+            <w:gridSpan w:val="2"/>
           </w:tcPr>
           <w:p>
             <w:r>

</xml_diff>